<commit_message>
edit website testign doc and fix w3c errors on visit page
</commit_message>
<xml_diff>
--- a/Website Testing.docx
+++ b/Website Testing.docx
@@ -193,8 +193,8 @@
         <w:tblLook w:val="04A0" w:firstRow="1" w:lastRow="0" w:firstColumn="1" w:lastColumn="0" w:noHBand="0" w:noVBand="1"/>
       </w:tblPr>
       <w:tblGrid>
-        <w:gridCol w:w="6257"/>
-        <w:gridCol w:w="7691"/>
+        <w:gridCol w:w="854"/>
+        <w:gridCol w:w="13094"/>
       </w:tblGrid>
       <w:tr>
         <w:trPr>
@@ -351,11 +351,69 @@
                 <w:rFonts w:asciiTheme="majorHAnsi" w:hAnsiTheme="majorHAnsi"/>
               </w:rPr>
             </w:pPr>
-            <w:r>
+            <w:hyperlink r:id="rId7" w:history="1">
+              <w:r>
+                <w:rPr>
+                  <w:rStyle w:val="Hyperlink"/>
+                  <w:rFonts w:asciiTheme="majorHAnsi" w:hAnsiTheme="majorHAnsi"/>
+                </w:rPr>
+                <w:t>https://wakodono.github.io/nescol-farm-site/</w:t>
+              </w:r>
+            </w:hyperlink>
+          </w:p>
+          <w:p>
+            <w:pPr>
               <w:rPr>
                 <w:rFonts w:asciiTheme="majorHAnsi" w:hAnsiTheme="majorHAnsi"/>
               </w:rPr>
-              <w:t>https://wakodono.github.io/nescol-farm-site/</w:t>
+            </w:pPr>
+          </w:p>
+          <w:p>
+            <w:pPr>
+              <w:rPr>
+                <w:rFonts w:asciiTheme="majorHAnsi" w:hAnsiTheme="majorHAnsi"/>
+              </w:rPr>
+            </w:pPr>
+            <w:r>
+              <w:rPr>
+                <w:rFonts w:asciiTheme="majorHAnsi" w:hAnsiTheme="majorHAnsi"/>
+              </w:rPr>
+              <w:lastRenderedPageBreak/>
+              <w:drawing>
+                <wp:inline distT="0" distB="0" distL="0" distR="0" wp14:anchorId="47C9EB1A" wp14:editId="284D1BF7">
+                  <wp:extent cx="8863330" cy="2301240"/>
+                  <wp:effectExtent l="0" t="0" r="0" b="3810"/>
+                  <wp:docPr id="1" name="Picture 1"/>
+                  <wp:cNvGraphicFramePr>
+                    <a:graphicFrameLocks xmlns:a="http://schemas.openxmlformats.org/drawingml/2006/main" noChangeAspect="1"/>
+                  </wp:cNvGraphicFramePr>
+                  <a:graphic xmlns:a="http://schemas.openxmlformats.org/drawingml/2006/main">
+                    <a:graphicData uri="http://schemas.openxmlformats.org/drawingml/2006/picture">
+                      <pic:pic xmlns:pic="http://schemas.openxmlformats.org/drawingml/2006/picture">
+                        <pic:nvPicPr>
+                          <pic:cNvPr id="1" name=""/>
+                          <pic:cNvPicPr/>
+                        </pic:nvPicPr>
+                        <pic:blipFill>
+                          <a:blip r:embed="rId8"/>
+                          <a:stretch>
+                            <a:fillRect/>
+                          </a:stretch>
+                        </pic:blipFill>
+                        <pic:spPr>
+                          <a:xfrm>
+                            <a:off x="0" y="0"/>
+                            <a:ext cx="8863330" cy="2301240"/>
+                          </a:xfrm>
+                          <a:prstGeom prst="rect">
+                            <a:avLst/>
+                          </a:prstGeom>
+                        </pic:spPr>
+                      </pic:pic>
+                    </a:graphicData>
+                  </a:graphic>
+                </wp:inline>
+              </w:drawing>
             </w:r>
           </w:p>
         </w:tc>
@@ -380,6 +438,7 @@
               <w:rPr>
                 <w:rFonts w:asciiTheme="majorHAnsi" w:hAnsiTheme="majorHAnsi"/>
               </w:rPr>
+              <w:lastRenderedPageBreak/>
               <w:t>Page</w:t>
             </w:r>
             <w:r>
@@ -449,7 +508,7 @@
                 <w:rFonts w:asciiTheme="majorHAnsi" w:hAnsiTheme="majorHAnsi"/>
               </w:rPr>
             </w:pPr>
-            <w:hyperlink r:id="rId7" w:history="1">
+            <w:hyperlink r:id="rId9" w:history="1">
               <w:r>
                 <w:rPr>
                   <w:rStyle w:val="Hyperlink"/>
@@ -1776,6 +1835,7 @@
               <w:rPr>
                 <w:lang w:val="en-US"/>
               </w:rPr>
+              <w:lastRenderedPageBreak/>
               <w:t>Chrome</w:t>
             </w:r>
           </w:p>
@@ -4112,7 +4172,7 @@
       </w:pPr>
     </w:p>
     <w:sectPr>
-      <w:headerReference w:type="default" r:id="rId8"/>
+      <w:headerReference w:type="default" r:id="rId10"/>
       <w:pgSz w:w="16838" w:h="11906" w:orient="landscape"/>
       <w:pgMar w:top="1440" w:right="1440" w:bottom="1440" w:left="1440" w:header="708" w:footer="708" w:gutter="0"/>
       <w:cols w:space="708"/>

</xml_diff>

<commit_message>
remove area labels from all html files according to w3c feedback and edit testing document
</commit_message>
<xml_diff>
--- a/Website Testing.docx
+++ b/Website Testing.docx
@@ -286,27 +286,13 @@
               <w:rPr>
                 <w:rFonts w:asciiTheme="majorHAnsi" w:hAnsiTheme="majorHAnsi"/>
               </w:rPr>
-              <w:t xml:space="preserve">Your website online </w:t>
-            </w:r>
-            <w:proofErr w:type="gramStart"/>
+              <w:t>Your website online link</w:t>
+            </w:r>
             <w:r>
               <w:rPr>
                 <w:rFonts w:asciiTheme="majorHAnsi" w:hAnsiTheme="majorHAnsi"/>
               </w:rPr>
-              <w:t>link</w:t>
-            </w:r>
-            <w:r>
-              <w:rPr>
-                <w:rFonts w:asciiTheme="majorHAnsi" w:hAnsiTheme="majorHAnsi"/>
-              </w:rPr>
-              <w:t>(</w:t>
-            </w:r>
-            <w:proofErr w:type="gramEnd"/>
-            <w:r>
-              <w:rPr>
-                <w:rFonts w:asciiTheme="majorHAnsi" w:hAnsiTheme="majorHAnsi"/>
-              </w:rPr>
-              <w:t>URL)</w:t>
+              <w:t>(URL)</w:t>
             </w:r>
           </w:p>
         </w:tc>
@@ -459,11 +445,68 @@
                 <w:rFonts w:asciiTheme="majorHAnsi" w:hAnsiTheme="majorHAnsi"/>
               </w:rPr>
             </w:pPr>
-            <w:r>
+            <w:hyperlink r:id="rId9" w:history="1">
+              <w:r>
+                <w:rPr>
+                  <w:rStyle w:val="Hyperlink"/>
+                  <w:rFonts w:asciiTheme="majorHAnsi" w:hAnsiTheme="majorHAnsi"/>
+                </w:rPr>
+                <w:t>https://wakodono.github.io/nescol-farm-site/visit.html</w:t>
+              </w:r>
+            </w:hyperlink>
+          </w:p>
+          <w:p>
+            <w:pPr>
               <w:rPr>
                 <w:rFonts w:asciiTheme="majorHAnsi" w:hAnsiTheme="majorHAnsi"/>
               </w:rPr>
-              <w:t>https://wakodono.github.io/nescol-farm-site/visit.html</w:t>
+            </w:pPr>
+          </w:p>
+          <w:p>
+            <w:pPr>
+              <w:rPr>
+                <w:rFonts w:asciiTheme="majorHAnsi" w:hAnsiTheme="majorHAnsi"/>
+              </w:rPr>
+            </w:pPr>
+            <w:r>
+              <w:rPr>
+                <w:rFonts w:asciiTheme="majorHAnsi" w:hAnsiTheme="majorHAnsi"/>
+              </w:rPr>
+              <w:drawing>
+                <wp:inline distT="0" distB="0" distL="0" distR="0" wp14:anchorId="6F75A202" wp14:editId="0ED515EC">
+                  <wp:extent cx="8863330" cy="2181225"/>
+                  <wp:effectExtent l="0" t="0" r="0" b="9525"/>
+                  <wp:docPr id="2" name="Picture 2"/>
+                  <wp:cNvGraphicFramePr>
+                    <a:graphicFrameLocks xmlns:a="http://schemas.openxmlformats.org/drawingml/2006/main" noChangeAspect="1"/>
+                  </wp:cNvGraphicFramePr>
+                  <a:graphic xmlns:a="http://schemas.openxmlformats.org/drawingml/2006/main">
+                    <a:graphicData uri="http://schemas.openxmlformats.org/drawingml/2006/picture">
+                      <pic:pic xmlns:pic="http://schemas.openxmlformats.org/drawingml/2006/picture">
+                        <pic:nvPicPr>
+                          <pic:cNvPr id="1" name=""/>
+                          <pic:cNvPicPr/>
+                        </pic:nvPicPr>
+                        <pic:blipFill>
+                          <a:blip r:embed="rId10"/>
+                          <a:stretch>
+                            <a:fillRect/>
+                          </a:stretch>
+                        </pic:blipFill>
+                        <pic:spPr>
+                          <a:xfrm>
+                            <a:off x="0" y="0"/>
+                            <a:ext cx="8863330" cy="2181225"/>
+                          </a:xfrm>
+                          <a:prstGeom prst="rect">
+                            <a:avLst/>
+                          </a:prstGeom>
+                        </pic:spPr>
+                      </pic:pic>
+                    </a:graphicData>
+                  </a:graphic>
+                </wp:inline>
+              </w:drawing>
             </w:r>
           </w:p>
         </w:tc>
@@ -508,7 +551,7 @@
                 <w:rFonts w:asciiTheme="majorHAnsi" w:hAnsiTheme="majorHAnsi"/>
               </w:rPr>
             </w:pPr>
-            <w:hyperlink r:id="rId9" w:history="1">
+            <w:hyperlink r:id="rId11" w:history="1">
               <w:r>
                 <w:rPr>
                   <w:rStyle w:val="Hyperlink"/>
@@ -589,6 +632,7 @@
               <w:rPr>
                 <w:rFonts w:asciiTheme="majorHAnsi" w:hAnsiTheme="majorHAnsi"/>
               </w:rPr>
+              <w:lastRenderedPageBreak/>
               <w:t>Page</w:t>
             </w:r>
             <w:r>
@@ -1835,7 +1879,6 @@
               <w:rPr>
                 <w:lang w:val="en-US"/>
               </w:rPr>
-              <w:lastRenderedPageBreak/>
               <w:t>Chrome</w:t>
             </w:r>
           </w:p>
@@ -4172,7 +4215,7 @@
       </w:pPr>
     </w:p>
     <w:sectPr>
-      <w:headerReference w:type="default" r:id="rId10"/>
+      <w:headerReference w:type="default" r:id="rId12"/>
       <w:pgSz w:w="16838" w:h="11906" w:orient="landscape"/>
       <w:pgMar w:top="1440" w:right="1440" w:bottom="1440" w:left="1440" w:header="708" w:footer="708" w:gutter="0"/>
       <w:cols w:space="708"/>

</xml_diff>

<commit_message>
Update README checklist with test status emojis
</commit_message>
<xml_diff>
--- a/Website Testing.docx
+++ b/Website Testing.docx
@@ -548,6 +548,7 @@
           <w:p>
             <w:pPr>
               <w:rPr>
+                <w:rStyle w:val="Hyperlink"/>
                 <w:rFonts w:asciiTheme="majorHAnsi" w:hAnsiTheme="majorHAnsi"/>
               </w:rPr>
             </w:pPr>
@@ -561,6 +562,62 @@
               </w:r>
             </w:hyperlink>
           </w:p>
+          <w:p>
+            <w:pPr>
+              <w:rPr>
+                <w:rStyle w:val="Hyperlink"/>
+                <w:rFonts w:asciiTheme="majorHAnsi" w:hAnsiTheme="majorHAnsi"/>
+              </w:rPr>
+            </w:pPr>
+          </w:p>
+          <w:p>
+            <w:pPr>
+              <w:rPr>
+                <w:rFonts w:asciiTheme="majorHAnsi" w:hAnsiTheme="majorHAnsi"/>
+              </w:rPr>
+            </w:pPr>
+            <w:r>
+              <w:rPr>
+                <w:rFonts w:asciiTheme="majorHAnsi" w:hAnsiTheme="majorHAnsi"/>
+              </w:rPr>
+              <w:lastRenderedPageBreak/>
+              <w:drawing>
+                <wp:inline distT="0" distB="0" distL="0" distR="0" wp14:anchorId="47F85298" wp14:editId="1C857F24">
+                  <wp:extent cx="8863330" cy="2116455"/>
+                  <wp:effectExtent l="0" t="0" r="0" b="0"/>
+                  <wp:docPr id="3" name="Picture 3"/>
+                  <wp:cNvGraphicFramePr>
+                    <a:graphicFrameLocks xmlns:a="http://schemas.openxmlformats.org/drawingml/2006/main" noChangeAspect="1"/>
+                  </wp:cNvGraphicFramePr>
+                  <a:graphic xmlns:a="http://schemas.openxmlformats.org/drawingml/2006/main">
+                    <a:graphicData uri="http://schemas.openxmlformats.org/drawingml/2006/picture">
+                      <pic:pic xmlns:pic="http://schemas.openxmlformats.org/drawingml/2006/picture">
+                        <pic:nvPicPr>
+                          <pic:cNvPr id="1" name=""/>
+                          <pic:cNvPicPr/>
+                        </pic:nvPicPr>
+                        <pic:blipFill>
+                          <a:blip r:embed="rId12"/>
+                          <a:stretch>
+                            <a:fillRect/>
+                          </a:stretch>
+                        </pic:blipFill>
+                        <pic:spPr>
+                          <a:xfrm>
+                            <a:off x="0" y="0"/>
+                            <a:ext cx="8863330" cy="2116455"/>
+                          </a:xfrm>
+                          <a:prstGeom prst="rect">
+                            <a:avLst/>
+                          </a:prstGeom>
+                        </pic:spPr>
+                      </pic:pic>
+                    </a:graphicData>
+                  </a:graphic>
+                </wp:inline>
+              </w:drawing>
+            </w:r>
+          </w:p>
         </w:tc>
       </w:tr>
       <w:tr>
@@ -583,6 +640,7 @@
               <w:rPr>
                 <w:rFonts w:asciiTheme="majorHAnsi" w:hAnsiTheme="majorHAnsi"/>
               </w:rPr>
+              <w:lastRenderedPageBreak/>
               <w:t>Page</w:t>
             </w:r>
             <w:r>
@@ -603,11 +661,68 @@
                 <w:rFonts w:asciiTheme="majorHAnsi" w:hAnsiTheme="majorHAnsi"/>
               </w:rPr>
             </w:pPr>
-            <w:r>
+            <w:hyperlink r:id="rId13" w:history="1">
+              <w:r>
+                <w:rPr>
+                  <w:rStyle w:val="Hyperlink"/>
+                  <w:rFonts w:asciiTheme="majorHAnsi" w:hAnsiTheme="majorHAnsi"/>
+                </w:rPr>
+                <w:t>https://wakodono.github.io/nescol-farm-site/animals.html</w:t>
+              </w:r>
+            </w:hyperlink>
+          </w:p>
+          <w:p>
+            <w:pPr>
               <w:rPr>
                 <w:rFonts w:asciiTheme="majorHAnsi" w:hAnsiTheme="majorHAnsi"/>
               </w:rPr>
-              <w:t>https://wakodono.github.io/nescol-farm-site/animals.html</w:t>
+            </w:pPr>
+          </w:p>
+          <w:p>
+            <w:pPr>
+              <w:rPr>
+                <w:rFonts w:asciiTheme="majorHAnsi" w:hAnsiTheme="majorHAnsi"/>
+              </w:rPr>
+            </w:pPr>
+            <w:r>
+              <w:rPr>
+                <w:rFonts w:asciiTheme="majorHAnsi" w:hAnsiTheme="majorHAnsi"/>
+              </w:rPr>
+              <w:drawing>
+                <wp:inline distT="0" distB="0" distL="0" distR="0" wp14:anchorId="3848BC80" wp14:editId="597455D6">
+                  <wp:extent cx="8863330" cy="2208530"/>
+                  <wp:effectExtent l="0" t="0" r="0" b="1270"/>
+                  <wp:docPr id="5" name="Picture 5"/>
+                  <wp:cNvGraphicFramePr>
+                    <a:graphicFrameLocks xmlns:a="http://schemas.openxmlformats.org/drawingml/2006/main" noChangeAspect="1"/>
+                  </wp:cNvGraphicFramePr>
+                  <a:graphic xmlns:a="http://schemas.openxmlformats.org/drawingml/2006/main">
+                    <a:graphicData uri="http://schemas.openxmlformats.org/drawingml/2006/picture">
+                      <pic:pic xmlns:pic="http://schemas.openxmlformats.org/drawingml/2006/picture">
+                        <pic:nvPicPr>
+                          <pic:cNvPr id="1" name=""/>
+                          <pic:cNvPicPr/>
+                        </pic:nvPicPr>
+                        <pic:blipFill>
+                          <a:blip r:embed="rId14"/>
+                          <a:stretch>
+                            <a:fillRect/>
+                          </a:stretch>
+                        </pic:blipFill>
+                        <pic:spPr>
+                          <a:xfrm>
+                            <a:off x="0" y="0"/>
+                            <a:ext cx="8863330" cy="2208530"/>
+                          </a:xfrm>
+                          <a:prstGeom prst="rect">
+                            <a:avLst/>
+                          </a:prstGeom>
+                        </pic:spPr>
+                      </pic:pic>
+                    </a:graphicData>
+                  </a:graphic>
+                </wp:inline>
+              </w:drawing>
             </w:r>
           </w:p>
         </w:tc>
@@ -632,32 +747,89 @@
               <w:rPr>
                 <w:rFonts w:asciiTheme="majorHAnsi" w:hAnsiTheme="majorHAnsi"/>
               </w:rPr>
+              <w:t>Page</w:t>
+            </w:r>
+            <w:r>
+              <w:rPr>
+                <w:rFonts w:asciiTheme="majorHAnsi" w:hAnsiTheme="majorHAnsi"/>
+              </w:rPr>
+              <w:t>5</w:t>
+            </w:r>
+          </w:p>
+        </w:tc>
+        <w:tc>
+          <w:tcPr>
+            <w:tcW w:w="2757" w:type="pct"/>
+          </w:tcPr>
+          <w:p>
+            <w:pPr>
+              <w:rPr>
+                <w:rFonts w:asciiTheme="majorHAnsi" w:hAnsiTheme="majorHAnsi"/>
+              </w:rPr>
+            </w:pPr>
+            <w:hyperlink r:id="rId15" w:history="1">
+              <w:r>
+                <w:rPr>
+                  <w:rStyle w:val="Hyperlink"/>
+                  <w:rFonts w:asciiTheme="majorHAnsi" w:hAnsiTheme="majorHAnsi"/>
+                </w:rPr>
+                <w:t>https://wakodono.github.io/nescol-farm-site/cafe.html</w:t>
+              </w:r>
+            </w:hyperlink>
+          </w:p>
+          <w:p>
+            <w:pPr>
+              <w:rPr>
+                <w:rFonts w:asciiTheme="majorHAnsi" w:hAnsiTheme="majorHAnsi"/>
+              </w:rPr>
+            </w:pPr>
+          </w:p>
+          <w:p>
+            <w:pPr>
+              <w:rPr>
+                <w:rFonts w:asciiTheme="majorHAnsi" w:hAnsiTheme="majorHAnsi"/>
+              </w:rPr>
+            </w:pPr>
+            <w:r>
+              <w:rPr>
+                <w:rFonts w:asciiTheme="majorHAnsi" w:hAnsiTheme="majorHAnsi"/>
+              </w:rPr>
               <w:lastRenderedPageBreak/>
-              <w:t>Page</w:t>
-            </w:r>
-            <w:r>
-              <w:rPr>
-                <w:rFonts w:asciiTheme="majorHAnsi" w:hAnsiTheme="majorHAnsi"/>
-              </w:rPr>
-              <w:t>5</w:t>
-            </w:r>
-          </w:p>
-        </w:tc>
-        <w:tc>
-          <w:tcPr>
-            <w:tcW w:w="2757" w:type="pct"/>
-          </w:tcPr>
-          <w:p>
-            <w:pPr>
-              <w:rPr>
-                <w:rFonts w:asciiTheme="majorHAnsi" w:hAnsiTheme="majorHAnsi"/>
-              </w:rPr>
-            </w:pPr>
-            <w:r>
-              <w:rPr>
-                <w:rFonts w:asciiTheme="majorHAnsi" w:hAnsiTheme="majorHAnsi"/>
-              </w:rPr>
-              <w:t>https://wakodono.github.io/nescol-farm-site/cafe.html</w:t>
+              <w:drawing>
+                <wp:inline distT="0" distB="0" distL="0" distR="0" wp14:anchorId="3506B126" wp14:editId="5CC6DBCA">
+                  <wp:extent cx="8863330" cy="2242185"/>
+                  <wp:effectExtent l="0" t="0" r="0" b="5715"/>
+                  <wp:docPr id="6" name="Picture 6"/>
+                  <wp:cNvGraphicFramePr>
+                    <a:graphicFrameLocks xmlns:a="http://schemas.openxmlformats.org/drawingml/2006/main" noChangeAspect="1"/>
+                  </wp:cNvGraphicFramePr>
+                  <a:graphic xmlns:a="http://schemas.openxmlformats.org/drawingml/2006/main">
+                    <a:graphicData uri="http://schemas.openxmlformats.org/drawingml/2006/picture">
+                      <pic:pic xmlns:pic="http://schemas.openxmlformats.org/drawingml/2006/picture">
+                        <pic:nvPicPr>
+                          <pic:cNvPr id="1" name=""/>
+                          <pic:cNvPicPr/>
+                        </pic:nvPicPr>
+                        <pic:blipFill>
+                          <a:blip r:embed="rId16"/>
+                          <a:stretch>
+                            <a:fillRect/>
+                          </a:stretch>
+                        </pic:blipFill>
+                        <pic:spPr>
+                          <a:xfrm>
+                            <a:off x="0" y="0"/>
+                            <a:ext cx="8863330" cy="2242185"/>
+                          </a:xfrm>
+                          <a:prstGeom prst="rect">
+                            <a:avLst/>
+                          </a:prstGeom>
+                        </pic:spPr>
+                      </pic:pic>
+                    </a:graphicData>
+                  </a:graphic>
+                </wp:inline>
+              </w:drawing>
             </w:r>
           </w:p>
         </w:tc>
@@ -682,6 +854,7 @@
               <w:rPr>
                 <w:rFonts w:asciiTheme="majorHAnsi" w:hAnsiTheme="majorHAnsi"/>
               </w:rPr>
+              <w:lastRenderedPageBreak/>
               <w:t>Page</w:t>
             </w:r>
             <w:r>
@@ -702,11 +875,68 @@
                 <w:rFonts w:asciiTheme="majorHAnsi" w:hAnsiTheme="majorHAnsi"/>
               </w:rPr>
             </w:pPr>
-            <w:r>
+            <w:hyperlink r:id="rId17" w:history="1">
+              <w:r>
+                <w:rPr>
+                  <w:rStyle w:val="Hyperlink"/>
+                  <w:rFonts w:asciiTheme="majorHAnsi" w:hAnsiTheme="majorHAnsi"/>
+                </w:rPr>
+                <w:t>https://wakodono.github.io/nescol-farm-site/play-park.html</w:t>
+              </w:r>
+            </w:hyperlink>
+          </w:p>
+          <w:p>
+            <w:pPr>
               <w:rPr>
                 <w:rFonts w:asciiTheme="majorHAnsi" w:hAnsiTheme="majorHAnsi"/>
               </w:rPr>
-              <w:t>https://wakodono.github.io/nescol-farm-site/play-park.html</w:t>
+            </w:pPr>
+          </w:p>
+          <w:p>
+            <w:pPr>
+              <w:rPr>
+                <w:rFonts w:asciiTheme="majorHAnsi" w:hAnsiTheme="majorHAnsi"/>
+              </w:rPr>
+            </w:pPr>
+            <w:r>
+              <w:rPr>
+                <w:rFonts w:asciiTheme="majorHAnsi" w:hAnsiTheme="majorHAnsi"/>
+              </w:rPr>
+              <w:drawing>
+                <wp:inline distT="0" distB="0" distL="0" distR="0" wp14:anchorId="083AAA2B" wp14:editId="4D9EE97E">
+                  <wp:extent cx="8863330" cy="2106295"/>
+                  <wp:effectExtent l="0" t="0" r="0" b="8255"/>
+                  <wp:docPr id="7" name="Picture 7"/>
+                  <wp:cNvGraphicFramePr>
+                    <a:graphicFrameLocks xmlns:a="http://schemas.openxmlformats.org/drawingml/2006/main" noChangeAspect="1"/>
+                  </wp:cNvGraphicFramePr>
+                  <a:graphic xmlns:a="http://schemas.openxmlformats.org/drawingml/2006/main">
+                    <a:graphicData uri="http://schemas.openxmlformats.org/drawingml/2006/picture">
+                      <pic:pic xmlns:pic="http://schemas.openxmlformats.org/drawingml/2006/picture">
+                        <pic:nvPicPr>
+                          <pic:cNvPr id="1" name=""/>
+                          <pic:cNvPicPr/>
+                        </pic:nvPicPr>
+                        <pic:blipFill>
+                          <a:blip r:embed="rId18"/>
+                          <a:stretch>
+                            <a:fillRect/>
+                          </a:stretch>
+                        </pic:blipFill>
+                        <pic:spPr>
+                          <a:xfrm>
+                            <a:off x="0" y="0"/>
+                            <a:ext cx="8863330" cy="2106295"/>
+                          </a:xfrm>
+                          <a:prstGeom prst="rect">
+                            <a:avLst/>
+                          </a:prstGeom>
+                        </pic:spPr>
+                      </pic:pic>
+                    </a:graphicData>
+                  </a:graphic>
+                </wp:inline>
+              </w:drawing>
             </w:r>
           </w:p>
         </w:tc>
@@ -751,11 +981,69 @@
                 <w:rFonts w:asciiTheme="majorHAnsi" w:hAnsiTheme="majorHAnsi"/>
               </w:rPr>
             </w:pPr>
-            <w:r>
+            <w:hyperlink r:id="rId19" w:history="1">
+              <w:r>
+                <w:rPr>
+                  <w:rStyle w:val="Hyperlink"/>
+                  <w:rFonts w:asciiTheme="majorHAnsi" w:hAnsiTheme="majorHAnsi"/>
+                </w:rPr>
+                <w:t>https://wakodono.github.io/nescol-farm-site/walks.html</w:t>
+              </w:r>
+            </w:hyperlink>
+          </w:p>
+          <w:p>
+            <w:pPr>
               <w:rPr>
                 <w:rFonts w:asciiTheme="majorHAnsi" w:hAnsiTheme="majorHAnsi"/>
               </w:rPr>
-              <w:t>https://wakodono.github.io/nescol-farm-site/walks.html</w:t>
+            </w:pPr>
+          </w:p>
+          <w:p>
+            <w:pPr>
+              <w:rPr>
+                <w:rFonts w:asciiTheme="majorHAnsi" w:hAnsiTheme="majorHAnsi"/>
+              </w:rPr>
+            </w:pPr>
+            <w:r>
+              <w:rPr>
+                <w:rFonts w:asciiTheme="majorHAnsi" w:hAnsiTheme="majorHAnsi"/>
+              </w:rPr>
+              <w:lastRenderedPageBreak/>
+              <w:drawing>
+                <wp:inline distT="0" distB="0" distL="0" distR="0" wp14:anchorId="411751D3" wp14:editId="36AAD888">
+                  <wp:extent cx="8863330" cy="2092960"/>
+                  <wp:effectExtent l="0" t="0" r="0" b="2540"/>
+                  <wp:docPr id="8" name="Picture 8"/>
+                  <wp:cNvGraphicFramePr>
+                    <a:graphicFrameLocks xmlns:a="http://schemas.openxmlformats.org/drawingml/2006/main" noChangeAspect="1"/>
+                  </wp:cNvGraphicFramePr>
+                  <a:graphic xmlns:a="http://schemas.openxmlformats.org/drawingml/2006/main">
+                    <a:graphicData uri="http://schemas.openxmlformats.org/drawingml/2006/picture">
+                      <pic:pic xmlns:pic="http://schemas.openxmlformats.org/drawingml/2006/picture">
+                        <pic:nvPicPr>
+                          <pic:cNvPr id="1" name=""/>
+                          <pic:cNvPicPr/>
+                        </pic:nvPicPr>
+                        <pic:blipFill>
+                          <a:blip r:embed="rId20"/>
+                          <a:stretch>
+                            <a:fillRect/>
+                          </a:stretch>
+                        </pic:blipFill>
+                        <pic:spPr>
+                          <a:xfrm>
+                            <a:off x="0" y="0"/>
+                            <a:ext cx="8863330" cy="2092960"/>
+                          </a:xfrm>
+                          <a:prstGeom prst="rect">
+                            <a:avLst/>
+                          </a:prstGeom>
+                        </pic:spPr>
+                      </pic:pic>
+                    </a:graphicData>
+                  </a:graphic>
+                </wp:inline>
+              </w:drawing>
             </w:r>
           </w:p>
         </w:tc>
@@ -3187,6 +3475,7 @@
               <w:rPr>
                 <w:lang w:val="en-US"/>
               </w:rPr>
+              <w:lastRenderedPageBreak/>
               <w:t>Web page loads and</w:t>
             </w:r>
             <w:r>
@@ -4215,7 +4504,7 @@
       </w:pPr>
     </w:p>
     <w:sectPr>
-      <w:headerReference w:type="default" r:id="rId12"/>
+      <w:headerReference w:type="default" r:id="rId21"/>
       <w:pgSz w:w="16838" w:h="11906" w:orient="landscape"/>
       <w:pgMar w:top="1440" w:right="1440" w:bottom="1440" w:left="1440" w:header="708" w:footer="708" w:gutter="0"/>
       <w:cols w:space="708"/>
@@ -4432,6 +4721,155 @@
     </w:lvl>
   </w:abstractNum>
   <w:abstractNum w:abstractNumId="1" w15:restartNumberingAfterBreak="0">
+    <w:nsid w:val="40140AD6"/>
+    <w:multiLevelType w:val="multilevel"/>
+    <w:tmpl w:val="AC42F1BE"/>
+    <w:lvl w:ilvl="0">
+      <w:start w:val="1"/>
+      <w:numFmt w:val="bullet"/>
+      <w:lvlText w:val=""/>
+      <w:lvlJc w:val="left"/>
+      <w:pPr>
+        <w:tabs>
+          <w:tab w:val="num" w:pos="720"/>
+        </w:tabs>
+        <w:ind w:left="720" w:hanging="360"/>
+      </w:pPr>
+      <w:rPr>
+        <w:rFonts w:ascii="Symbol" w:hAnsi="Symbol" w:hint="default"/>
+        <w:sz w:val="20"/>
+      </w:rPr>
+    </w:lvl>
+    <w:lvl w:ilvl="1" w:tentative="1">
+      <w:start w:val="1"/>
+      <w:numFmt w:val="bullet"/>
+      <w:lvlText w:val="o"/>
+      <w:lvlJc w:val="left"/>
+      <w:pPr>
+        <w:tabs>
+          <w:tab w:val="num" w:pos="1440"/>
+        </w:tabs>
+        <w:ind w:left="1440" w:hanging="360"/>
+      </w:pPr>
+      <w:rPr>
+        <w:rFonts w:ascii="Courier New" w:hAnsi="Courier New" w:hint="default"/>
+        <w:sz w:val="20"/>
+      </w:rPr>
+    </w:lvl>
+    <w:lvl w:ilvl="2" w:tentative="1">
+      <w:start w:val="1"/>
+      <w:numFmt w:val="bullet"/>
+      <w:lvlText w:val=""/>
+      <w:lvlJc w:val="left"/>
+      <w:pPr>
+        <w:tabs>
+          <w:tab w:val="num" w:pos="2160"/>
+        </w:tabs>
+        <w:ind w:left="2160" w:hanging="360"/>
+      </w:pPr>
+      <w:rPr>
+        <w:rFonts w:ascii="Wingdings" w:hAnsi="Wingdings" w:hint="default"/>
+        <w:sz w:val="20"/>
+      </w:rPr>
+    </w:lvl>
+    <w:lvl w:ilvl="3" w:tentative="1">
+      <w:start w:val="1"/>
+      <w:numFmt w:val="bullet"/>
+      <w:lvlText w:val=""/>
+      <w:lvlJc w:val="left"/>
+      <w:pPr>
+        <w:tabs>
+          <w:tab w:val="num" w:pos="2880"/>
+        </w:tabs>
+        <w:ind w:left="2880" w:hanging="360"/>
+      </w:pPr>
+      <w:rPr>
+        <w:rFonts w:ascii="Wingdings" w:hAnsi="Wingdings" w:hint="default"/>
+        <w:sz w:val="20"/>
+      </w:rPr>
+    </w:lvl>
+    <w:lvl w:ilvl="4" w:tentative="1">
+      <w:start w:val="1"/>
+      <w:numFmt w:val="bullet"/>
+      <w:lvlText w:val=""/>
+      <w:lvlJc w:val="left"/>
+      <w:pPr>
+        <w:tabs>
+          <w:tab w:val="num" w:pos="3600"/>
+        </w:tabs>
+        <w:ind w:left="3600" w:hanging="360"/>
+      </w:pPr>
+      <w:rPr>
+        <w:rFonts w:ascii="Wingdings" w:hAnsi="Wingdings" w:hint="default"/>
+        <w:sz w:val="20"/>
+      </w:rPr>
+    </w:lvl>
+    <w:lvl w:ilvl="5" w:tentative="1">
+      <w:start w:val="1"/>
+      <w:numFmt w:val="bullet"/>
+      <w:lvlText w:val=""/>
+      <w:lvlJc w:val="left"/>
+      <w:pPr>
+        <w:tabs>
+          <w:tab w:val="num" w:pos="4320"/>
+        </w:tabs>
+        <w:ind w:left="4320" w:hanging="360"/>
+      </w:pPr>
+      <w:rPr>
+        <w:rFonts w:ascii="Wingdings" w:hAnsi="Wingdings" w:hint="default"/>
+        <w:sz w:val="20"/>
+      </w:rPr>
+    </w:lvl>
+    <w:lvl w:ilvl="6" w:tentative="1">
+      <w:start w:val="1"/>
+      <w:numFmt w:val="bullet"/>
+      <w:lvlText w:val=""/>
+      <w:lvlJc w:val="left"/>
+      <w:pPr>
+        <w:tabs>
+          <w:tab w:val="num" w:pos="5040"/>
+        </w:tabs>
+        <w:ind w:left="5040" w:hanging="360"/>
+      </w:pPr>
+      <w:rPr>
+        <w:rFonts w:ascii="Wingdings" w:hAnsi="Wingdings" w:hint="default"/>
+        <w:sz w:val="20"/>
+      </w:rPr>
+    </w:lvl>
+    <w:lvl w:ilvl="7" w:tentative="1">
+      <w:start w:val="1"/>
+      <w:numFmt w:val="bullet"/>
+      <w:lvlText w:val=""/>
+      <w:lvlJc w:val="left"/>
+      <w:pPr>
+        <w:tabs>
+          <w:tab w:val="num" w:pos="5760"/>
+        </w:tabs>
+        <w:ind w:left="5760" w:hanging="360"/>
+      </w:pPr>
+      <w:rPr>
+        <w:rFonts w:ascii="Wingdings" w:hAnsi="Wingdings" w:hint="default"/>
+        <w:sz w:val="20"/>
+      </w:rPr>
+    </w:lvl>
+    <w:lvl w:ilvl="8" w:tentative="1">
+      <w:start w:val="1"/>
+      <w:numFmt w:val="bullet"/>
+      <w:lvlText w:val=""/>
+      <w:lvlJc w:val="left"/>
+      <w:pPr>
+        <w:tabs>
+          <w:tab w:val="num" w:pos="6480"/>
+        </w:tabs>
+        <w:ind w:left="6480" w:hanging="360"/>
+      </w:pPr>
+      <w:rPr>
+        <w:rFonts w:ascii="Wingdings" w:hAnsi="Wingdings" w:hint="default"/>
+        <w:sz w:val="20"/>
+      </w:rPr>
+    </w:lvl>
+  </w:abstractNum>
+  <w:abstractNum w:abstractNumId="2" w15:restartNumberingAfterBreak="0">
     <w:nsid w:val="4BC04586"/>
     <w:multiLevelType w:val="hybridMultilevel"/>
     <w:tmpl w:val="DAD0D9EE"/>
@@ -4543,7 +4981,7 @@
       </w:rPr>
     </w:lvl>
   </w:abstractNum>
-  <w:abstractNum w:abstractNumId="2" w15:restartNumberingAfterBreak="0">
+  <w:abstractNum w:abstractNumId="3" w15:restartNumberingAfterBreak="0">
     <w:nsid w:val="6F76479B"/>
     <w:multiLevelType w:val="hybridMultilevel"/>
     <w:tmpl w:val="8DE625FA"/>
@@ -4659,9 +5097,12 @@
     <w:abstractNumId w:val="0"/>
   </w:num>
   <w:num w:numId="2">
+    <w:abstractNumId w:val="3"/>
+  </w:num>
+  <w:num w:numId="3">
     <w:abstractNumId w:val="2"/>
   </w:num>
-  <w:num w:numId="3">
+  <w:num w:numId="4">
     <w:abstractNumId w:val="1"/>
   </w:num>
 </w:numbering>
@@ -5117,7 +5558,6 @@
   <w:style w:type="character" w:default="1" w:styleId="DefaultParagraphFont">
     <w:name w:val="Default Paragraph Font"/>
     <w:uiPriority w:val="1"/>
-    <w:semiHidden/>
     <w:unhideWhenUsed/>
   </w:style>
   <w:style w:type="table" w:default="1" w:styleId="TableNormal">

</xml_diff>

<commit_message>
Commit recent local changes
</commit_message>
<xml_diff>
--- a/Website Testing.docx
+++ b/Website Testing.docx
@@ -181,6 +181,76 @@
     </w:p>
     <w:p>
       <w:pPr>
+        <w:pStyle w:val="ListParagraph"/>
+        <w:rPr>
+          <w:rFonts w:asciiTheme="majorHAnsi" w:hAnsiTheme="majorHAnsi"/>
+        </w:rPr>
+      </w:pPr>
+      <w:r>
+        <w:rPr>
+          <w:rFonts w:asciiTheme="majorHAnsi" w:hAnsiTheme="majorHAnsi"/>
+        </w:rPr>
+        <w:drawing>
+          <wp:inline distT="0" distB="0" distL="0" distR="0" wp14:anchorId="381CBC7E" wp14:editId="41780FB4">
+            <wp:extent cx="8211696" cy="2695951"/>
+            <wp:effectExtent l="0" t="0" r="0" b="9525"/>
+            <wp:docPr id="9" name="Picture 9"/>
+            <wp:cNvGraphicFramePr>
+              <a:graphicFrameLocks xmlns:a="http://schemas.openxmlformats.org/drawingml/2006/main" noChangeAspect="1"/>
+            </wp:cNvGraphicFramePr>
+            <a:graphic xmlns:a="http://schemas.openxmlformats.org/drawingml/2006/main">
+              <a:graphicData uri="http://schemas.openxmlformats.org/drawingml/2006/picture">
+                <pic:pic xmlns:pic="http://schemas.openxmlformats.org/drawingml/2006/picture">
+                  <pic:nvPicPr>
+                    <pic:cNvPr id="1" name=""/>
+                    <pic:cNvPicPr/>
+                  </pic:nvPicPr>
+                  <pic:blipFill>
+                    <a:blip r:embed="rId7"/>
+                    <a:stretch>
+                      <a:fillRect/>
+                    </a:stretch>
+                  </pic:blipFill>
+                  <pic:spPr>
+                    <a:xfrm>
+                      <a:off x="0" y="0"/>
+                      <a:ext cx="8211696" cy="2695951"/>
+                    </a:xfrm>
+                    <a:prstGeom prst="rect">
+                      <a:avLst/>
+                    </a:prstGeom>
+                  </pic:spPr>
+                </pic:pic>
+              </a:graphicData>
+            </a:graphic>
+          </wp:inline>
+        </w:drawing>
+      </w:r>
+    </w:p>
+    <w:p>
+      <w:pPr>
+        <w:spacing w:after="160" w:line="259" w:lineRule="auto"/>
+        <w:rPr>
+          <w:rFonts w:asciiTheme="majorHAnsi" w:hAnsiTheme="majorHAnsi"/>
+        </w:rPr>
+      </w:pPr>
+      <w:r>
+        <w:rPr>
+          <w:rFonts w:asciiTheme="majorHAnsi" w:hAnsiTheme="majorHAnsi"/>
+        </w:rPr>
+        <w:br w:type="page"/>
+      </w:r>
+    </w:p>
+    <w:p>
+      <w:pPr>
+        <w:pStyle w:val="ListParagraph"/>
+        <w:rPr>
+          <w:rFonts w:asciiTheme="majorHAnsi" w:hAnsiTheme="majorHAnsi"/>
+        </w:rPr>
+      </w:pPr>
+    </w:p>
+    <w:p>
+      <w:pPr>
         <w:rPr>
           <w:rFonts w:asciiTheme="majorHAnsi" w:hAnsiTheme="majorHAnsi"/>
         </w:rPr>
@@ -286,13 +356,27 @@
               <w:rPr>
                 <w:rFonts w:asciiTheme="majorHAnsi" w:hAnsiTheme="majorHAnsi"/>
               </w:rPr>
-              <w:t>Your website online link</w:t>
-            </w:r>
+              <w:t xml:space="preserve">Your website online </w:t>
+            </w:r>
+            <w:proofErr w:type="gramStart"/>
             <w:r>
               <w:rPr>
                 <w:rFonts w:asciiTheme="majorHAnsi" w:hAnsiTheme="majorHAnsi"/>
               </w:rPr>
-              <w:t>(URL)</w:t>
+              <w:t>link</w:t>
+            </w:r>
+            <w:r>
+              <w:rPr>
+                <w:rFonts w:asciiTheme="majorHAnsi" w:hAnsiTheme="majorHAnsi"/>
+              </w:rPr>
+              <w:t>(</w:t>
+            </w:r>
+            <w:proofErr w:type="gramEnd"/>
+            <w:r>
+              <w:rPr>
+                <w:rFonts w:asciiTheme="majorHAnsi" w:hAnsiTheme="majorHAnsi"/>
+              </w:rPr>
+              <w:t>URL)</w:t>
             </w:r>
           </w:p>
         </w:tc>
@@ -337,7 +421,7 @@
                 <w:rFonts w:asciiTheme="majorHAnsi" w:hAnsiTheme="majorHAnsi"/>
               </w:rPr>
             </w:pPr>
-            <w:hyperlink r:id="rId7" w:history="1">
+            <w:hyperlink r:id="rId8" w:history="1">
               <w:r>
                 <w:rPr>
                   <w:rStyle w:val="Hyperlink"/>
@@ -364,7 +448,6 @@
               <w:rPr>
                 <w:rFonts w:asciiTheme="majorHAnsi" w:hAnsiTheme="majorHAnsi"/>
               </w:rPr>
-              <w:lastRenderedPageBreak/>
               <w:drawing>
                 <wp:inline distT="0" distB="0" distL="0" distR="0" wp14:anchorId="47C9EB1A" wp14:editId="284D1BF7">
                   <wp:extent cx="8863330" cy="2301240"/>
@@ -381,7 +464,7 @@
                           <pic:cNvPicPr/>
                         </pic:nvPicPr>
                         <pic:blipFill>
-                          <a:blip r:embed="rId8"/>
+                          <a:blip r:embed="rId9"/>
                           <a:stretch>
                             <a:fillRect/>
                           </a:stretch>
@@ -424,7 +507,6 @@
               <w:rPr>
                 <w:rFonts w:asciiTheme="majorHAnsi" w:hAnsiTheme="majorHAnsi"/>
               </w:rPr>
-              <w:lastRenderedPageBreak/>
               <w:t>Page</w:t>
             </w:r>
             <w:r>
@@ -445,7 +527,7 @@
                 <w:rFonts w:asciiTheme="majorHAnsi" w:hAnsiTheme="majorHAnsi"/>
               </w:rPr>
             </w:pPr>
-            <w:hyperlink r:id="rId9" w:history="1">
+            <w:hyperlink r:id="rId10" w:history="1">
               <w:r>
                 <w:rPr>
                   <w:rStyle w:val="Hyperlink"/>
@@ -472,6 +554,7 @@
               <w:rPr>
                 <w:rFonts w:asciiTheme="majorHAnsi" w:hAnsiTheme="majorHAnsi"/>
               </w:rPr>
+              <w:lastRenderedPageBreak/>
               <w:drawing>
                 <wp:inline distT="0" distB="0" distL="0" distR="0" wp14:anchorId="6F75A202" wp14:editId="0ED515EC">
                   <wp:extent cx="8863330" cy="2181225"/>
@@ -488,7 +571,7 @@
                           <pic:cNvPicPr/>
                         </pic:nvPicPr>
                         <pic:blipFill>
-                          <a:blip r:embed="rId10"/>
+                          <a:blip r:embed="rId11"/>
                           <a:stretch>
                             <a:fillRect/>
                           </a:stretch>
@@ -531,6 +614,7 @@
               <w:rPr>
                 <w:rFonts w:asciiTheme="majorHAnsi" w:hAnsiTheme="majorHAnsi"/>
               </w:rPr>
+              <w:lastRenderedPageBreak/>
               <w:t>Page</w:t>
             </w:r>
             <w:r>
@@ -552,7 +636,7 @@
                 <w:rFonts w:asciiTheme="majorHAnsi" w:hAnsiTheme="majorHAnsi"/>
               </w:rPr>
             </w:pPr>
-            <w:hyperlink r:id="rId11" w:history="1">
+            <w:hyperlink r:id="rId12" w:history="1">
               <w:r>
                 <w:rPr>
                   <w:rStyle w:val="Hyperlink"/>
@@ -580,7 +664,6 @@
               <w:rPr>
                 <w:rFonts w:asciiTheme="majorHAnsi" w:hAnsiTheme="majorHAnsi"/>
               </w:rPr>
-              <w:lastRenderedPageBreak/>
               <w:drawing>
                 <wp:inline distT="0" distB="0" distL="0" distR="0" wp14:anchorId="47F85298" wp14:editId="1C857F24">
                   <wp:extent cx="8863330" cy="2116455"/>
@@ -597,7 +680,7 @@
                           <pic:cNvPicPr/>
                         </pic:nvPicPr>
                         <pic:blipFill>
-                          <a:blip r:embed="rId12"/>
+                          <a:blip r:embed="rId13"/>
                           <a:stretch>
                             <a:fillRect/>
                           </a:stretch>
@@ -640,7 +723,6 @@
               <w:rPr>
                 <w:rFonts w:asciiTheme="majorHAnsi" w:hAnsiTheme="majorHAnsi"/>
               </w:rPr>
-              <w:lastRenderedPageBreak/>
               <w:t>Page</w:t>
             </w:r>
             <w:r>
@@ -661,7 +743,7 @@
                 <w:rFonts w:asciiTheme="majorHAnsi" w:hAnsiTheme="majorHAnsi"/>
               </w:rPr>
             </w:pPr>
-            <w:hyperlink r:id="rId13" w:history="1">
+            <w:hyperlink r:id="rId14" w:history="1">
               <w:r>
                 <w:rPr>
                   <w:rStyle w:val="Hyperlink"/>
@@ -688,6 +770,7 @@
               <w:rPr>
                 <w:rFonts w:asciiTheme="majorHAnsi" w:hAnsiTheme="majorHAnsi"/>
               </w:rPr>
+              <w:lastRenderedPageBreak/>
               <w:drawing>
                 <wp:inline distT="0" distB="0" distL="0" distR="0" wp14:anchorId="3848BC80" wp14:editId="597455D6">
                   <wp:extent cx="8863330" cy="2208530"/>
@@ -704,7 +787,7 @@
                           <pic:cNvPicPr/>
                         </pic:nvPicPr>
                         <pic:blipFill>
-                          <a:blip r:embed="rId14"/>
+                          <a:blip r:embed="rId15"/>
                           <a:stretch>
                             <a:fillRect/>
                           </a:stretch>
@@ -747,6 +830,7 @@
               <w:rPr>
                 <w:rFonts w:asciiTheme="majorHAnsi" w:hAnsiTheme="majorHAnsi"/>
               </w:rPr>
+              <w:lastRenderedPageBreak/>
               <w:t>Page</w:t>
             </w:r>
             <w:r>
@@ -767,7 +851,7 @@
                 <w:rFonts w:asciiTheme="majorHAnsi" w:hAnsiTheme="majorHAnsi"/>
               </w:rPr>
             </w:pPr>
-            <w:hyperlink r:id="rId15" w:history="1">
+            <w:hyperlink r:id="rId16" w:history="1">
               <w:r>
                 <w:rPr>
                   <w:rStyle w:val="Hyperlink"/>
@@ -794,7 +878,6 @@
               <w:rPr>
                 <w:rFonts w:asciiTheme="majorHAnsi" w:hAnsiTheme="majorHAnsi"/>
               </w:rPr>
-              <w:lastRenderedPageBreak/>
               <w:drawing>
                 <wp:inline distT="0" distB="0" distL="0" distR="0" wp14:anchorId="3506B126" wp14:editId="5CC6DBCA">
                   <wp:extent cx="8863330" cy="2242185"/>
@@ -811,7 +894,7 @@
                           <pic:cNvPicPr/>
                         </pic:nvPicPr>
                         <pic:blipFill>
-                          <a:blip r:embed="rId16"/>
+                          <a:blip r:embed="rId17"/>
                           <a:stretch>
                             <a:fillRect/>
                           </a:stretch>
@@ -854,7 +937,6 @@
               <w:rPr>
                 <w:rFonts w:asciiTheme="majorHAnsi" w:hAnsiTheme="majorHAnsi"/>
               </w:rPr>
-              <w:lastRenderedPageBreak/>
               <w:t>Page</w:t>
             </w:r>
             <w:r>
@@ -875,7 +957,7 @@
                 <w:rFonts w:asciiTheme="majorHAnsi" w:hAnsiTheme="majorHAnsi"/>
               </w:rPr>
             </w:pPr>
-            <w:hyperlink r:id="rId17" w:history="1">
+            <w:hyperlink r:id="rId18" w:history="1">
               <w:r>
                 <w:rPr>
                   <w:rStyle w:val="Hyperlink"/>
@@ -902,6 +984,7 @@
               <w:rPr>
                 <w:rFonts w:asciiTheme="majorHAnsi" w:hAnsiTheme="majorHAnsi"/>
               </w:rPr>
+              <w:lastRenderedPageBreak/>
               <w:drawing>
                 <wp:inline distT="0" distB="0" distL="0" distR="0" wp14:anchorId="083AAA2B" wp14:editId="4D9EE97E">
                   <wp:extent cx="8863330" cy="2106295"/>
@@ -918,7 +1001,7 @@
                           <pic:cNvPicPr/>
                         </pic:nvPicPr>
                         <pic:blipFill>
-                          <a:blip r:embed="rId18"/>
+                          <a:blip r:embed="rId19"/>
                           <a:stretch>
                             <a:fillRect/>
                           </a:stretch>
@@ -961,6 +1044,7 @@
               <w:rPr>
                 <w:rFonts w:asciiTheme="majorHAnsi" w:hAnsiTheme="majorHAnsi"/>
               </w:rPr>
+              <w:lastRenderedPageBreak/>
               <w:t>Page</w:t>
             </w:r>
             <w:r>
@@ -981,7 +1065,7 @@
                 <w:rFonts w:asciiTheme="majorHAnsi" w:hAnsiTheme="majorHAnsi"/>
               </w:rPr>
             </w:pPr>
-            <w:hyperlink r:id="rId19" w:history="1">
+            <w:hyperlink r:id="rId20" w:history="1">
               <w:r>
                 <w:rPr>
                   <w:rStyle w:val="Hyperlink"/>
@@ -1008,7 +1092,6 @@
               <w:rPr>
                 <w:rFonts w:asciiTheme="majorHAnsi" w:hAnsiTheme="majorHAnsi"/>
               </w:rPr>
-              <w:lastRenderedPageBreak/>
               <w:drawing>
                 <wp:inline distT="0" distB="0" distL="0" distR="0" wp14:anchorId="411751D3" wp14:editId="36AAD888">
                   <wp:extent cx="8863330" cy="2092960"/>
@@ -1025,7 +1108,7 @@
                           <pic:cNvPicPr/>
                         </pic:nvPicPr>
                         <pic:blipFill>
-                          <a:blip r:embed="rId20"/>
+                          <a:blip r:embed="rId21"/>
                           <a:stretch>
                             <a:fillRect/>
                           </a:stretch>
@@ -1415,6 +1498,7 @@
               <w:rPr>
                 <w:lang w:val="en-US"/>
               </w:rPr>
+              <w:lastRenderedPageBreak/>
               <w:t>Web page loads and</w:t>
             </w:r>
             <w:r>
@@ -3475,7 +3559,6 @@
               <w:rPr>
                 <w:lang w:val="en-US"/>
               </w:rPr>
-              <w:lastRenderedPageBreak/>
               <w:t>Web page loads and</w:t>
             </w:r>
             <w:r>
@@ -4504,7 +4587,7 @@
       </w:pPr>
     </w:p>
     <w:sectPr>
-      <w:headerReference w:type="default" r:id="rId21"/>
+      <w:headerReference w:type="default" r:id="rId22"/>
       <w:pgSz w:w="16838" w:h="11906" w:orient="landscape"/>
       <w:pgMar w:top="1440" w:right="1440" w:bottom="1440" w:left="1440" w:header="708" w:footer="708" w:gutter="0"/>
       <w:cols w:space="708"/>

</xml_diff>